<commit_message>
Replace custom CI/CD exporter with native metrics and Infinity REST monitoring
</commit_message>
<xml_diff>
--- a/docs/devops-cicd-monitoring-request.docx
+++ b/docs/devops-cicd-monitoring-request.docx
@@ -17,12 +17,12 @@
     </w:p>
     <w:p>
       <w:r>
-        <w:t>Просим подключить TeamCity, Jenkins и Octopus к существующим Prometheus и Grafana. Начать с одного pipeline в каждой CI системе и одного Octopus project/environment. Готовые конфигурации и код адаптера находятся в репозитории sbrw-evc/Test. После проверки расширить scope.</w:t>
+        <w:t>Просим подключить TeamCity, Jenkins и Octopus к существующим Prometheus и Grafana без собственных экспортеров. Использовать штатные метрики и готовые open-source компоненты. Репозиторий с конфигурациями: github.com/sbrw-evc/Test.</w:t>
       </w:r>
     </w:p>
     <w:p>
       <w:r>
-        <w:t>Первая версия показывает доступность, последние результаты и длительность, очереди и online agents TeamCity/Jenkins. Сначала настроить сбор, затем импортировать dashboard и проверить уведомления.</w:t>
+        <w:t>Начать с одного TeamCity buildType, выбранных Jenkins jobs и одного Octopus project/environment. После приёмки перечислить остальные критичные pipelines и повторить queries/alerts с отдельными UID. Проверочный scope не покрывает автоматически все проекты.</w:t>
       </w:r>
     </w:p>
     <w:p>
@@ -30,12 +30,7 @@
         <w:pStyle w:val="Heading1"/>
       </w:pPr>
       <w:r>
-        <w:t>1 Заполнить параметры</w:t>
-      </w:r>
-    </w:p>
-    <w:p>
-      <w:r>
-        <w:t>Скопировать adapter/config.example.yml в adapter/config.yml. Заменить примерные URLs и IDs фактическими. Все команды далее выполняются из корня репозитория.</w:t>
+        <w:t>1 Выбрать источники и заполнить параметры</w:t>
       </w:r>
     </w:p>
     <w:tbl>
@@ -45,8 +40,8 @@
         <w:tblLook w:firstColumn="1" w:firstRow="1" w:lastColumn="0" w:lastRow="0" w:noHBand="0" w:noVBand="1" w:val="04A0"/>
       </w:tblPr>
       <w:tblGrid>
-        <w:gridCol w:w="2952"/>
-        <w:gridCol w:w="7200"/>
+        <w:gridCol w:w="1656"/>
+        <w:gridCol w:w="8496"/>
       </w:tblGrid>
       <w:tr>
         <w:trPr>
@@ -54,7 +49,7 @@
         </w:trPr>
         <w:tc>
           <w:tcPr>
-            <w:tcW w:type="dxa" w:w="2952"/>
+            <w:tcW w:type="dxa" w:w="1656"/>
             <w:tcBorders>
               <w:top w:val="single" w:sz="4" w:color="D9D9D9"/>
               <w:left w:val="single" w:sz="4" w:color="D9D9D9"/>
@@ -72,13 +67,13 @@
                 <w:b/>
                 <w:sz w:val="19"/>
               </w:rPr>
-              <w:t>Что заполнить</w:t>
+              <w:t>Система</w:t>
             </w:r>
           </w:p>
         </w:tc>
         <w:tc>
           <w:tcPr>
-            <w:tcW w:type="dxa" w:w="7200"/>
+            <w:tcW w:type="dxa" w:w="8496"/>
             <w:tcBorders>
               <w:top w:val="single" w:sz="4" w:color="D9D9D9"/>
               <w:left w:val="single" w:sz="4" w:color="D9D9D9"/>
@@ -96,7 +91,7 @@
                 <w:b/>
                 <w:sz w:val="19"/>
               </w:rPr>
-              <w:t>Где и как</w:t>
+              <w:t>Источник данных</w:t>
             </w:r>
           </w:p>
         </w:tc>
@@ -104,7 +99,7 @@
       <w:tr>
         <w:tc>
           <w:tcPr>
-            <w:tcW w:type="dxa" w:w="2952"/>
+            <w:tcW w:type="dxa" w:w="1656"/>
             <w:tcBorders>
               <w:top w:val="single" w:sz="4" w:color="D9D9D9"/>
               <w:left w:val="single" w:sz="4" w:color="D9D9D9"/>
@@ -120,13 +115,13 @@
               <w:rPr>
                 <w:sz w:val="19"/>
               </w:rPr>
-              <w:t>Namespaces и selector label</w:t>
+              <w:t>TeamCity</w:t>
             </w:r>
           </w:p>
         </w:tc>
         <w:tc>
           <w:tcPr>
-            <w:tcW w:type="dxa" w:w="7200"/>
+            <w:tcW w:type="dxa" w:w="8496"/>
             <w:tcBorders>
               <w:top w:val="single" w:sz="4" w:color="D9D9D9"/>
               <w:left w:val="single" w:sz="4" w:color="D9D9D9"/>
@@ -142,7 +137,7 @@
               <w:rPr>
                 <w:sz w:val="19"/>
               </w:rPr>
-              <w:t>В kubernetes/*.yml: monitoring, cicd и release. Сверить с существующим Prometheus CR.</w:t>
+              <w:t>/app/metrics — агенты и очередь; REST через Infinity — результат и длительность выбранной сборки.</w:t>
             </w:r>
           </w:p>
         </w:tc>
@@ -150,7 +145,7 @@
       <w:tr>
         <w:tc>
           <w:tcPr>
-            <w:tcW w:type="dxa" w:w="2952"/>
+            <w:tcW w:type="dxa" w:w="1656"/>
             <w:tcBorders>
               <w:top w:val="single" w:sz="4" w:color="D9D9D9"/>
               <w:left w:val="single" w:sz="4" w:color="D9D9D9"/>
@@ -166,13 +161,13 @@
               <w:rPr>
                 <w:sz w:val="19"/>
               </w:rPr>
-              <w:t>URLs и scopes</w:t>
+              <w:t>Jenkins</w:t>
             </w:r>
           </w:p>
         </w:tc>
         <w:tc>
           <w:tcPr>
-            <w:tcW w:type="dxa" w:w="7200"/>
+            <w:tcW w:type="dxa" w:w="8496"/>
             <w:tcBorders>
               <w:top w:val="single" w:sz="4" w:color="D9D9D9"/>
               <w:left w:val="single" w:sz="4" w:color="D9D9D9"/>
@@ -188,7 +183,7 @@
               <w:rPr>
                 <w:sz w:val="19"/>
               </w:rPr>
-              <w:t>TeamCity build_type; Jenkins encoded job_path; Octopus space, project_id, environment_id.</w:t>
+              <w:t>jenkinsci/prometheus-plugin — /prometheus/, jobs, nodes, executors и queue.</w:t>
             </w:r>
           </w:p>
         </w:tc>
@@ -196,7 +191,7 @@
       <w:tr>
         <w:tc>
           <w:tcPr>
-            <w:tcW w:type="dxa" w:w="2952"/>
+            <w:tcW w:type="dxa" w:w="1656"/>
             <w:tcBorders>
               <w:top w:val="single" w:sz="4" w:color="D9D9D9"/>
               <w:left w:val="single" w:sz="4" w:color="D9D9D9"/>
@@ -212,13 +207,13 @@
               <w:rPr>
                 <w:sz w:val="19"/>
               </w:rPr>
-              <w:t>Подписи и пороги</w:t>
+              <w:t>Octopus</w:t>
             </w:r>
           </w:p>
         </w:tc>
         <w:tc>
           <w:tcPr>
-            <w:tcW w:type="dxa" w:w="7200"/>
+            <w:tcW w:type="dxa" w:w="8496"/>
             <w:tcBorders>
               <w:top w:val="single" w:sz="4" w:color="D9D9D9"/>
               <w:left w:val="single" w:sz="4" w:color="D9D9D9"/>
@@ -234,7 +229,7 @@
               <w:rPr>
                 <w:sz w:val="19"/>
               </w:rPr>
-              <w:t>project/pipeline — стабильные подписи; env — контур сбора. queue_limit, agents_minimum, timeout_seconds согласовать с командой.</w:t>
+              <w:t>REST deployment tasks через grafana/grafana-infinity-datasource, backend JSONata.</w:t>
             </w:r>
           </w:p>
         </w:tc>
@@ -242,7 +237,7 @@
       <w:tr>
         <w:tc>
           <w:tcPr>
-            <w:tcW w:type="dxa" w:w="2952"/>
+            <w:tcW w:type="dxa" w:w="1656"/>
             <w:tcBorders>
               <w:top w:val="single" w:sz="4" w:color="D9D9D9"/>
               <w:left w:val="single" w:sz="4" w:color="D9D9D9"/>
@@ -258,13 +253,13 @@
               <w:rPr>
                 <w:sz w:val="19"/>
               </w:rPr>
-              <w:t>Постоянные агенты</w:t>
+              <w:t>Доступность</w:t>
             </w:r>
           </w:p>
         </w:tc>
         <w:tc>
           <w:tcPr>
-            <w:tcW w:type="dxa" w:w="7200"/>
+            <w:tcW w:type="dxa" w:w="8496"/>
             <w:tcBorders>
               <w:top w:val="single" w:sz="4" w:color="D9D9D9"/>
               <w:left w:val="single" w:sz="4" w:color="D9D9D9"/>
@@ -280,53 +275,7 @@
               <w:rPr>
                 <w:sz w:val="19"/>
               </w:rPr>
-              <w:t>expected_agents — ID TeamCity или displayName Jenkins. Ephemeral Pods не включать.</w:t>
-            </w:r>
-          </w:p>
-        </w:tc>
-      </w:tr>
-      <w:tr>
-        <w:tc>
-          <w:tcPr>
-            <w:tcW w:type="dxa" w:w="2952"/>
-            <w:tcBorders>
-              <w:top w:val="single" w:sz="4" w:color="D9D9D9"/>
-              <w:left w:val="single" w:sz="4" w:color="D9D9D9"/>
-              <w:bottom w:val="single" w:sz="4" w:color="D9D9D9"/>
-              <w:right w:val="single" w:sz="4" w:color="D9D9D9"/>
-            </w:tcBorders>
-          </w:tcPr>
-          <w:p>
-            <w:pPr>
-              <w:spacing w:after="80" w:before="80"/>
-            </w:pPr>
-            <w:r>
-              <w:rPr>
-                <w:sz w:val="19"/>
-              </w:rPr>
-              <w:t>Образ и TLS</w:t>
-            </w:r>
-          </w:p>
-        </w:tc>
-        <w:tc>
-          <w:tcPr>
-            <w:tcW w:type="dxa" w:w="7200"/>
-            <w:tcBorders>
-              <w:top w:val="single" w:sz="4" w:color="D9D9D9"/>
-              <w:left w:val="single" w:sz="4" w:color="D9D9D9"/>
-              <w:bottom w:val="single" w:sz="4" w:color="D9D9D9"/>
-              <w:right w:val="single" w:sz="4" w:color="D9D9D9"/>
-            </w:tcBorders>
-          </w:tcPr>
-          <w:p>
-            <w:pPr>
-              <w:spacing w:after="80" w:before="80"/>
-            </w:pPr>
-            <w:r>
-              <w:rPr>
-                <w:sz w:val="19"/>
-              </w:rPr>
-              <w:t>Registry/image, named Service ports и внутренний CA, если нужен.</w:t>
+              <w:t>prometheus/blackbox_exporter — HTTP status и response duration.</w:t>
             </w:r>
           </w:p>
         </w:tc>
@@ -334,40 +283,45 @@
     </w:tbl>
     <w:p/>
     <w:p>
-      <w:pPr>
-        <w:pStyle w:val="Heading1"/>
-      </w:pPr>
       <w:r>
-        <w:t>2 Выдать доступ на чтение</w:t>
+        <w:t>Из корня репозитория установить зависимости генератора, скопировать пример и заполнить URLs, IDs, фильтры агентов и пороги. Генератор только создаёт файлы; в кластере он не работает.</w:t>
       </w:r>
     </w:p>
     <w:p>
       <w:pPr>
-        <w:pStyle w:val="ListBullet"/>
+        <w:pStyle w:val="Code"/>
       </w:pPr>
       <w:r>
-        <w:t>TeamCity: API token, чтение выбранных проектов, очереди и агентов; для /app/metrics — View usage statistics.</w:t>
+        <w:t>python3 -m venv .venv</w:t>
       </w:r>
     </w:p>
     <w:p>
       <w:pPr>
-        <w:pStyle w:val="ListBullet"/>
+        <w:pStyle w:val="Code"/>
       </w:pPr>
       <w:r>
-        <w:t>Jenkins: сервисный пользователь + API token; Overall Read, Job Read, чтение computer/queue. Установить Prometheus Plugin и проверить /prometheus/.</w:t>
+        <w:t>.venv/bin/pip install -r scripts/requirements.txt</w:t>
       </w:r>
     </w:p>
     <w:p>
       <w:pPr>
-        <w:pStyle w:val="ListBullet"/>
+        <w:pStyle w:val="Code"/>
       </w:pPr>
       <w:r>
-        <w:t>Octopus: API key с чтением Space, проектов, environments и deployment tasks. Проверить API по Swagger установленной версии.</w:t>
+        <w:t>cp monitoring-config.example.yml monitoring-config.yml</w:t>
+      </w:r>
+    </w:p>
+    <w:p>
+      <w:pPr>
+        <w:pStyle w:val="Code"/>
+      </w:pPr>
+      <w:r>
+        <w:t>.venv/bin/python scripts/generate_monitoring.py monitoring-config.yml</w:t>
       </w:r>
     </w:p>
     <w:p>
       <w:r>
-        <w:t>Никаких прав на запуск сборок и деплоев адаптеру не требуется.</w:t>
+        <w:t>Согласовать минимальное число агентов, размер очереди и timeout сборок. Jenkins capacity label должна обозначать один pool: пересекающиеся labels не суммировать. В expected agent/node включать только постоянные агенты. Если их нет — удалить соответствующие expected-agent панели и правила до применения.</w:t>
       </w:r>
     </w:p>
     <w:p>
@@ -380,12 +334,81 @@
         <w:pStyle w:val="Heading1"/>
       </w:pPr>
       <w:r>
-        <w:t>3 Создать секреты и проверить сеть</w:t>
+        <w:t>2 Выдать доступ и подключить native metrics</w:t>
+      </w:r>
+    </w:p>
+    <w:p>
+      <w:pPr>
+        <w:pStyle w:val="ListBullet"/>
+      </w:pPr>
+      <w:r>
+        <w:t>TeamCity: токен с чтением выбранного проекта, builds и agents. Для /app/metrics требуется View usage statistics. Проверить REST с Accept application/json.</w:t>
+      </w:r>
+    </w:p>
+    <w:p>
+      <w:pPr>
+        <w:pStyle w:val="ListBullet"/>
+      </w:pPr>
+      <w:r>
+        <w:t>Jenkins: установить Prometheus Plugin, включить build metrics. Сохранить default_jenkins prefix и job attribute jenkins_job. Проверить endpoint /prometheus/ с учётом context path и внутренний collection interval плагина.</w:t>
+      </w:r>
+    </w:p>
+    <w:p>
+      <w:pPr>
+        <w:pStyle w:val="ListBullet"/>
+      </w:pPr>
+      <w:r>
+        <w:t>Octopus: API key с чтением Space, projects, environments и deployment tasks. Проверить tasks endpoint установленной версии: JSON должен содержать TotalResults и Items.</w:t>
       </w:r>
     </w:p>
     <w:p>
       <w:r>
-        <w:t>Через корпоративный Secret manager создать cicd-api-credentials и cicd-native-credentials в namespace monitoring. Ручной вариант для первого запуска: создать credentials.env с правами 600, затем заполнить четыре KEY=value строки в редакторе.</w:t>
+        <w:t>Токены хранить в Secrets, не в Git. Native Secret cicd-native-credentials в namespace ServiceMonitor содержит TEAMCITY_TOKEN, JENKINS_USER, JENKINS_TOKEN. В Grafana Pod передать TEAMCITY_TOKEN и OCTOPUS_API_KEY через secretKeyRef.</w:t>
+      </w:r>
+    </w:p>
+    <w:p>
+      <w:r>
+        <w:t>Разрешить сеть Prometheus → TeamCity/Jenkins/blackbox; blackbox → HTTP endpoints; Grafana → Prometheus, TeamCity/Octopus API и получатели уведомлений.</w:t>
+      </w:r>
+    </w:p>
+    <w:p>
+      <w:pPr>
+        <w:pStyle w:val="Heading2"/>
+      </w:pPr>
+      <w:r>
+        <w:t>Настроить ServiceMonitor</w:t>
+      </w:r>
+    </w:p>
+    <w:p>
+      <w:pPr>
+        <w:pStyle w:val="ListBullet"/>
+      </w:pPr>
+      <w:r>
+        <w:t>В kubernetes/native-metrics.example.yml заменить namespaces, release label, Service selectors, named port, scheme, paths и TLS serverName.</w:t>
+      </w:r>
+    </w:p>
+    <w:p>
+      <w:pPr>
+        <w:pStyle w:val="ListBullet"/>
+      </w:pPr>
+      <w:r>
+        <w:t>На Services добавить monitoring-source=teamcity|jenkins, component=teamcity|jenkins и env согласно config. Проверить Endpoints.</w:t>
+      </w:r>
+    </w:p>
+    <w:p>
+      <w:pPr>
+        <w:pStyle w:val="ListBullet"/>
+      </w:pPr>
+      <w:r>
+        <w:t>Для частного CA создать cicd-ca ConfigMap с ca.crt в namespace ServiceMonitor. Для публичного CA удалить ненужную ссылку на ConfigMap. TLS verify сохранять.</w:t>
+      </w:r>
+    </w:p>
+    <w:p>
+      <w:pPr>
+        <w:pStyle w:val="ListBullet"/>
+      </w:pPr>
+      <w:r>
+        <w:t>Сверить selectors Prometheus CR для ServiceMonitor, Probe и PrometheusRule. Пример release=kube-prometheus-stack заменить фактическим.</w:t>
       </w:r>
     </w:p>
     <w:p>
@@ -393,7 +416,7 @@
         <w:pStyle w:val="Code"/>
       </w:pPr>
       <w:r>
-        <w:t>TEAMCITY_TOKEN=...</w:t>
+        <w:t>kubectl apply --dry-run=server -f kubernetes/native-metrics.example.yml</w:t>
       </w:r>
     </w:p>
     <w:p>
@@ -401,198 +424,12 @@
         <w:pStyle w:val="Code"/>
       </w:pPr>
       <w:r>
-        <w:t>JENKINS_USER=...</w:t>
-      </w:r>
-    </w:p>
-    <w:p>
-      <w:pPr>
-        <w:pStyle w:val="Code"/>
-      </w:pPr>
-      <w:r>
-        <w:t>JENKINS_TOKEN=...</w:t>
-      </w:r>
-    </w:p>
-    <w:p>
-      <w:pPr>
-        <w:pStyle w:val="Code"/>
-      </w:pPr>
-      <w:r>
-        <w:t>OCTOPUS_API_KEY=...</w:t>
-      </w:r>
-    </w:p>
-    <w:p>
-      <w:pPr>
-        <w:pStyle w:val="Code"/>
-      </w:pPr>
-      <w:r>
-        <w:t>kubectl -n monitoring create secret generic cicd-api-credentials \</w:t>
-      </w:r>
-    </w:p>
-    <w:p>
-      <w:pPr>
-        <w:pStyle w:val="Code"/>
-      </w:pPr>
-      <w:r>
-        <w:t xml:space="preserve">  --from-env-file=credentials.env --dry-run=client -o yaml | \</w:t>
-      </w:r>
-    </w:p>
-    <w:p>
-      <w:pPr>
-        <w:pStyle w:val="Code"/>
-      </w:pPr>
-      <w:r>
-        <w:t xml:space="preserve">  kubectl apply -f -</w:t>
-      </w:r>
-    </w:p>
-    <w:p>
-      <w:pPr>
-        <w:pStyle w:val="Code"/>
-      </w:pPr>
-      <w:r>
-        <w:t>kubectl -n monitoring create secret generic cicd-native-credentials \</w:t>
-      </w:r>
-    </w:p>
-    <w:p>
-      <w:pPr>
-        <w:pStyle w:val="Code"/>
-      </w:pPr>
-      <w:r>
-        <w:t xml:space="preserve">  --from-env-file=credentials.env --dry-run=client -o yaml | \</w:t>
-      </w:r>
-    </w:p>
-    <w:p>
-      <w:pPr>
-        <w:pStyle w:val="Code"/>
-      </w:pPr>
-      <w:r>
-        <w:t xml:space="preserve">  kubectl apply -f -</w:t>
+        <w:t>kubectl apply -f kubernetes/native-metrics.example.yml</w:t>
       </w:r>
     </w:p>
     <w:p>
       <w:r>
-        <w:t>Secret native может содержать только первые три ключа. Секреты в Git не сохранять. После переноса в Secret manager удалить локальный credentials.env.</w:t>
-      </w:r>
-    </w:p>
-    <w:p>
-      <w:pPr>
-        <w:pStyle w:val="ListBullet"/>
-      </w:pPr>
-      <w:r>
-        <w:t>Разрешить adapter → REST API трёх систем; Prometheus → adapter:8000 и native endpoints; blackbox → HTTP URLs; DNS TCP/UDP 53.</w:t>
-      </w:r>
-    </w:p>
-    <w:p>
-      <w:pPr>
-        <w:pStyle w:val="ListBullet"/>
-      </w:pPr>
-      <w:r>
-        <w:t>Сверить действующие NetworkPolicy и service mesh. Не менять изоляцию source Pods без проверки остальных потоков.</w:t>
-      </w:r>
-    </w:p>
-    <w:p>
-      <w:pPr>
-        <w:pStyle w:val="ListBullet"/>
-      </w:pPr>
-      <w:r>
-        <w:t>Проверять TLS. Для внутреннего CA создать ConfigMap cicd-ca, включить ca_file: /ca/ca.crt в source config и применить adapter-ca.patch.yml. CA также подключить в native monitors и blackbox. TLS verification не отключать.</w:t>
-      </w:r>
-    </w:p>
-    <w:p>
-      <w:pPr>
-        <w:pStyle w:val="Heading1"/>
-      </w:pPr>
-      <w:r>
-        <w:t>4 Собрать и установить адаптер</w:t>
-      </w:r>
-    </w:p>
-    <w:p>
-      <w:r>
-        <w:t>Адаптер уже реализован в adapter/exporter.py. Он делает только GET, отдаёт /metrics и не требует установки дополнительных агентов в CI/CD системах.</w:t>
-      </w:r>
-    </w:p>
-    <w:p>
-      <w:pPr>
-        <w:pStyle w:val="Code"/>
-      </w:pPr>
-      <w:r>
-        <w:t>docker build -t REGISTRY/monitoring/cicd-adapter:1.0.0 adapter</w:t>
-      </w:r>
-    </w:p>
-    <w:p>
-      <w:pPr>
-        <w:pStyle w:val="Code"/>
-      </w:pPr>
-      <w:r>
-        <w:t>docker push REGISTRY/monitoring/cicd-adapter:1.0.0</w:t>
-      </w:r>
-    </w:p>
-    <w:p>
-      <w:pPr>
-        <w:pStyle w:val="Code"/>
-      </w:pPr>
-      <w:r>
-        <w:t>kubectl -n monitoring create configmap cicd-adapter-config \</w:t>
-      </w:r>
-    </w:p>
-    <w:p>
-      <w:pPr>
-        <w:pStyle w:val="Code"/>
-      </w:pPr>
-      <w:r>
-        <w:t xml:space="preserve">  --from-file=config.yml=adapter/config.yml \</w:t>
-      </w:r>
-    </w:p>
-    <w:p>
-      <w:pPr>
-        <w:pStyle w:val="Code"/>
-      </w:pPr>
-      <w:r>
-        <w:t xml:space="preserve">  --dry-run=client -o yaml | kubectl apply -f -</w:t>
-      </w:r>
-    </w:p>
-    <w:p>
-      <w:pPr>
-        <w:pStyle w:val="Code"/>
-      </w:pPr>
-      <w:r>
-        <w:t># В adapter.yml заменить image и release label</w:t>
-      </w:r>
-    </w:p>
-    <w:p>
-      <w:pPr>
-        <w:pStyle w:val="Code"/>
-      </w:pPr>
-      <w:r>
-        <w:t>kubectl apply --dry-run=server -f kubernetes/adapter.yml</w:t>
-      </w:r>
-    </w:p>
-    <w:p>
-      <w:pPr>
-        <w:pStyle w:val="Code"/>
-      </w:pPr>
-      <w:r>
-        <w:t>kubectl apply -f kubernetes/adapter.yml</w:t>
-      </w:r>
-    </w:p>
-    <w:p>
-      <w:pPr>
-        <w:pStyle w:val="Code"/>
-      </w:pPr>
-      <w:r>
-        <w:t>kubectl -n monitoring rollout status deployment/cicd-adapter</w:t>
-      </w:r>
-    </w:p>
-    <w:p>
-      <w:pPr>
-        <w:pStyle w:val="Code"/>
-      </w:pPr>
-      <w:r>
-        <w:t>kubectl -n monitoring logs deployment/cicd-adapter</w:t>
-      </w:r>
-    </w:p>
-    <w:p>
-      <w:r>
-        <w:t>При внутреннем CA применить patch после установки. Для закрытого registry добавить imagePullSecrets. Одна replica, PVC не нужен; историю хранит Prometheus. После изменения ConfigMap/Secret выполнить rollout restart deployment/cicd-adapter.</w:t>
+        <w:t>Результат: в Targets есть job=teamcity и job=jenkins с up=1; возвращаются агенты и queue. Проверить ordinal последней сборки и runtime выполняющейся Jenkins build. Полный контракт — cicd-health/METRICS-CONTRACT.md.</w:t>
       </w:r>
     </w:p>
     <w:p>
@@ -605,12 +442,36 @@
         <w:pStyle w:val="Heading1"/>
       </w:pPr>
       <w:r>
-        <w:t>5 Подключить Prometheus</w:t>
+        <w:t>3 Подключить HTTP проверки и recording rules</w:t>
       </w:r>
     </w:p>
     <w:p>
       <w:r>
-        <w:t>Этот путь рассчитан на установленный Prometheus Operator. Если его нет, сначала подключить корпоративный monitoring stack либо использовать standalone scrape example из cicd-health. Не устанавливать второй stack поверх существующего.</w:t>
+        <w:t>Установить готовый prometheus/blackbox_exporter через принятый Helm/GitOps процесс или использовать существующий. Зафиксировать одобренную версию образа. Свой Deployment адаптера и сборка собственного образа не требуются.</w:t>
+      </w:r>
+    </w:p>
+    <w:p>
+      <w:pPr>
+        <w:pStyle w:val="ListBullet"/>
+      </w:pPr>
+      <w:r>
+        <w:t>Загрузить http_2xx module из cicd-health/blackbox.example.yml: timeout 10s, HTTP 2xx, TLS verify включён. Частный CA смонтировать в Pod и указать ca_file.</w:t>
+      </w:r>
+    </w:p>
+    <w:p>
+      <w:pPr>
+        <w:pStyle w:val="ListBullet"/>
+      </w:pPr>
+      <w:r>
+        <w:t>В kubernetes/probes.example.yml заменить blackbox Service URL, endpoints, env, namespace и release label. Сохранить jobName cicd-http, interval 30s, scrapeTimeout 15s.</w:t>
+      </w:r>
+    </w:p>
+    <w:p>
+      <w:pPr>
+        <w:pStyle w:val="ListBullet"/>
+      </w:pPr>
+      <w:r>
+        <w:t>TeamCity probe: /healthCheck/ready. Jenkins /login и Octopus / проверяют frontend. API проверяются отдельно. Убедиться, что proxy не выдаёт 200 при упавшем backend.</w:t>
       </w:r>
     </w:p>
     <w:p>
@@ -618,7 +479,7 @@
         <w:pStyle w:val="Code"/>
       </w:pPr>
       <w:r>
-        <w:t>kubectl get crd servicemonitors.monitoring.coreos.com \</w:t>
+        <w:t>kubectl apply --dry-run=server -f kubernetes/probes.example.yml</w:t>
       </w:r>
     </w:p>
     <w:p>
@@ -626,7 +487,7 @@
         <w:pStyle w:val="Code"/>
       </w:pPr>
       <w:r>
-        <w:t xml:space="preserve">  probes.monitoring.coreos.com prometheusrules.monitoring.coreos.com</w:t>
+        <w:t>kubectl apply -f kubernetes/probes.example.yml</w:t>
       </w:r>
     </w:p>
     <w:p>
@@ -634,12 +495,23 @@
         <w:pStyle w:val="Code"/>
       </w:pPr>
       <w:r>
-        <w:t>kubectl -n monitoring get prometheus -o yaml</w:t>
+        <w:t>kubectl apply --dry-run=server -f kubernetes/recording-rules.yml</w:t>
       </w:r>
     </w:p>
     <w:p>
+      <w:pPr>
+        <w:pStyle w:val="Code"/>
+      </w:pPr>
       <w:r>
-        <w:t>В Prometheus CR сверить selectors и namespaceSelectors для ServiceMonitor, Probe и rules. В примерах selection label — release: kube-prometheus-stack. Заменить его значением существующего stack.</w:t>
+        <w:t>kubectl apply -f kubernetes/recording-rules.yml</w:t>
+      </w:r>
+    </w:p>
+    <w:p>
+      <w:pPr>
+        <w:pStyle w:val="Heading2"/>
+      </w:pPr>
+      <w:r>
+        <w:t>Проверить результат в Prometheus</w:t>
       </w:r>
     </w:p>
     <w:tbl>
@@ -649,8 +521,8 @@
         <w:tblLook w:firstColumn="1" w:firstRow="1" w:lastColumn="0" w:lastRow="0" w:noHBand="0" w:noVBand="1" w:val="04A0"/>
       </w:tblPr>
       <w:tblGrid>
-        <w:gridCol w:w="3600"/>
-        <w:gridCol w:w="6552"/>
+        <w:gridCol w:w="3096"/>
+        <w:gridCol w:w="7056"/>
       </w:tblGrid>
       <w:tr>
         <w:trPr>
@@ -658,7 +530,7 @@
         </w:trPr>
         <w:tc>
           <w:tcPr>
-            <w:tcW w:type="dxa" w:w="3600"/>
+            <w:tcW w:type="dxa" w:w="3096"/>
             <w:tcBorders>
               <w:top w:val="single" w:sz="4" w:color="D9D9D9"/>
               <w:left w:val="single" w:sz="4" w:color="D9D9D9"/>
@@ -676,13 +548,13 @@
                 <w:b/>
                 <w:sz w:val="19"/>
               </w:rPr>
-              <w:t>Файл</w:t>
+              <w:t>Проверка</w:t>
             </w:r>
           </w:p>
         </w:tc>
         <w:tc>
           <w:tcPr>
-            <w:tcW w:type="dxa" w:w="6552"/>
+            <w:tcW w:type="dxa" w:w="7056"/>
             <w:tcBorders>
               <w:top w:val="single" w:sz="4" w:color="D9D9D9"/>
               <w:left w:val="single" w:sz="4" w:color="D9D9D9"/>
@@ -700,7 +572,7 @@
                 <w:b/>
                 <w:sz w:val="19"/>
               </w:rPr>
-              <w:t>Что сделать</w:t>
+              <w:t>Ожидаемый результат</w:t>
             </w:r>
           </w:p>
         </w:tc>
@@ -708,7 +580,7 @@
       <w:tr>
         <w:tc>
           <w:tcPr>
-            <w:tcW w:type="dxa" w:w="3600"/>
+            <w:tcW w:type="dxa" w:w="3096"/>
             <w:tcBorders>
               <w:top w:val="single" w:sz="4" w:color="D9D9D9"/>
               <w:left w:val="single" w:sz="4" w:color="D9D9D9"/>
@@ -724,13 +596,13 @@
               <w:rPr>
                 <w:sz w:val="19"/>
               </w:rPr>
-              <w:t>kubernetes/adapter.yml</w:t>
+              <w:t>probe_success</w:t>
             </w:r>
           </w:p>
         </w:tc>
         <w:tc>
           <w:tcPr>
-            <w:tcW w:type="dxa" w:w="6552"/>
+            <w:tcW w:type="dxa" w:w="7056"/>
             <w:tcBorders>
               <w:top w:val="single" w:sz="4" w:color="D9D9D9"/>
               <w:left w:val="single" w:sz="4" w:color="D9D9D9"/>
@@ -746,7 +618,7 @@
               <w:rPr>
                 <w:sz w:val="19"/>
               </w:rPr>
-              <w:t>ServiceMonitor уже включён. Сохранять honorLabels: true для env/component из адаптера.</w:t>
+              <w:t>Три component с job=cicd-http; 1 при исправном HTTP endpoint.</w:t>
             </w:r>
           </w:p>
         </w:tc>
@@ -754,7 +626,7 @@
       <w:tr>
         <w:tc>
           <w:tcPr>
-            <w:tcW w:type="dxa" w:w="3600"/>
+            <w:tcW w:type="dxa" w:w="3096"/>
             <w:tcBorders>
               <w:top w:val="single" w:sz="4" w:color="D9D9D9"/>
               <w:left w:val="single" w:sz="4" w:color="D9D9D9"/>
@@ -770,13 +642,13 @@
               <w:rPr>
                 <w:sz w:val="19"/>
               </w:rPr>
-              <w:t>native-metrics.example.yml</w:t>
+              <w:t>probe_duration_seconds</w:t>
             </w:r>
           </w:p>
         </w:tc>
         <w:tc>
           <w:tcPr>
-            <w:tcW w:type="dxa" w:w="6552"/>
+            <w:tcW w:type="dxa" w:w="7056"/>
             <w:tcBorders>
               <w:top w:val="single" w:sz="4" w:color="D9D9D9"/>
               <w:left w:val="single" w:sz="4" w:color="D9D9D9"/>
@@ -792,7 +664,7 @@
               <w:rPr>
                 <w:sz w:val="19"/>
               </w:rPr>
-              <w:t>На существующих Service добавить monitoring-source, component, env. Не менять Service selectors. Заменить namespace, named port, context path и TLS serverName. Secret находится в namespace ServiceMonitor.</w:t>
+              <w:t>Время ответа в секундах для каждого component.</w:t>
             </w:r>
           </w:p>
         </w:tc>
@@ -800,7 +672,7 @@
       <w:tr>
         <w:tc>
           <w:tcPr>
-            <w:tcW w:type="dxa" w:w="3600"/>
+            <w:tcW w:type="dxa" w:w="3096"/>
             <w:tcBorders>
               <w:top w:val="single" w:sz="4" w:color="D9D9D9"/>
               <w:left w:val="single" w:sz="4" w:color="D9D9D9"/>
@@ -816,13 +688,13 @@
               <w:rPr>
                 <w:sz w:val="19"/>
               </w:rPr>
-              <w:t>probes.example.yml</w:t>
+              <w:t>ci:expected_component</w:t>
             </w:r>
           </w:p>
         </w:tc>
         <w:tc>
           <w:tcPr>
-            <w:tcW w:type="dxa" w:w="6552"/>
+            <w:tcW w:type="dxa" w:w="7056"/>
             <w:tcBorders>
               <w:top w:val="single" w:sz="4" w:color="D9D9D9"/>
               <w:left w:val="single" w:sz="4" w:color="D9D9D9"/>
@@ -838,7 +710,7 @@
               <w:rPr>
                 <w:sz w:val="19"/>
               </w:rPr>
-              <w:t>Установить/использовать prometheus/blackbox_exporter с модулем http_2xx. Подставить URL Service exporter и URLs трёх систем. Один основной Probe на компонент.</w:t>
+              <w:t>Три ожидаемых component: teamcity, jenkins, octopus.</w:t>
             </w:r>
           </w:p>
         </w:tc>
@@ -846,7 +718,7 @@
       <w:tr>
         <w:tc>
           <w:tcPr>
-            <w:tcW w:type="dxa" w:w="3600"/>
+            <w:tcW w:type="dxa" w:w="3096"/>
             <w:tcBorders>
               <w:top w:val="single" w:sz="4" w:color="D9D9D9"/>
               <w:left w:val="single" w:sz="4" w:color="D9D9D9"/>
@@ -862,13 +734,13 @@
               <w:rPr>
                 <w:sz w:val="19"/>
               </w:rPr>
-              <w:t>recording-rules.yml</w:t>
+              <w:t>ci:infrastructure_state</w:t>
             </w:r>
           </w:p>
         </w:tc>
         <w:tc>
           <w:tcPr>
-            <w:tcW w:type="dxa" w:w="6552"/>
+            <w:tcW w:type="dxa" w:w="7056"/>
             <w:tcBorders>
               <w:top w:val="single" w:sz="4" w:color="D9D9D9"/>
               <w:left w:val="single" w:sz="4" w:color="D9D9D9"/>
@@ -884,7 +756,99 @@
               <w:rPr>
                 <w:sz w:val="19"/>
               </w:rPr>
-              <w:t>Подставить env и release label. Это готовый PrometheusRule для вычисления operational state.</w:t>
+              <w:t>0 DOWN, 1 UNKNOWN, 2 DEGRADED, 3 HEALTHY. REST добавляется в верхних карточках Grafana.</w:t>
+            </w:r>
+          </w:p>
+        </w:tc>
+      </w:tr>
+      <w:tr>
+        <w:tc>
+          <w:tcPr>
+            <w:tcW w:type="dxa" w:w="3096"/>
+            <w:tcBorders>
+              <w:top w:val="single" w:sz="4" w:color="D9D9D9"/>
+              <w:left w:val="single" w:sz="4" w:color="D9D9D9"/>
+              <w:bottom w:val="single" w:sz="4" w:color="D9D9D9"/>
+              <w:right w:val="single" w:sz="4" w:color="D9D9D9"/>
+            </w:tcBorders>
+          </w:tcPr>
+          <w:p>
+            <w:pPr>
+              <w:spacing w:after="80" w:before="80"/>
+            </w:pPr>
+            <w:r>
+              <w:rPr>
+                <w:sz w:val="19"/>
+              </w:rPr>
+              <w:t>ci:observation_missing</w:t>
+            </w:r>
+          </w:p>
+        </w:tc>
+        <w:tc>
+          <w:tcPr>
+            <w:tcW w:type="dxa" w:w="7056"/>
+            <w:tcBorders>
+              <w:top w:val="single" w:sz="4" w:color="D9D9D9"/>
+              <w:left w:val="single" w:sz="4" w:color="D9D9D9"/>
+              <w:bottom w:val="single" w:sz="4" w:color="D9D9D9"/>
+              <w:right w:val="single" w:sz="4" w:color="D9D9D9"/>
+            </w:tcBorders>
+          </w:tcPr>
+          <w:p>
+            <w:pPr>
+              <w:spacing w:after="80" w:before="80"/>
+            </w:pPr>
+            <w:r>
+              <w:rPr>
+                <w:sz w:val="19"/>
+              </w:rPr>
+              <w:t>0 при наличии ожидаемых probe/native KPI, 1 при их пропуске.</w:t>
+            </w:r>
+          </w:p>
+        </w:tc>
+      </w:tr>
+      <w:tr>
+        <w:tc>
+          <w:tcPr>
+            <w:tcW w:type="dxa" w:w="3096"/>
+            <w:tcBorders>
+              <w:top w:val="single" w:sz="4" w:color="D9D9D9"/>
+              <w:left w:val="single" w:sz="4" w:color="D9D9D9"/>
+              <w:bottom w:val="single" w:sz="4" w:color="D9D9D9"/>
+              <w:right w:val="single" w:sz="4" w:color="D9D9D9"/>
+            </w:tcBorders>
+          </w:tcPr>
+          <w:p>
+            <w:pPr>
+              <w:spacing w:after="80" w:before="80"/>
+            </w:pPr>
+            <w:r>
+              <w:rPr>
+                <w:sz w:val="19"/>
+              </w:rPr>
+              <w:t>Prometheus Rules</w:t>
+            </w:r>
+          </w:p>
+        </w:tc>
+        <w:tc>
+          <w:tcPr>
+            <w:tcW w:type="dxa" w:w="7056"/>
+            <w:tcBorders>
+              <w:top w:val="single" w:sz="4" w:color="D9D9D9"/>
+              <w:left w:val="single" w:sz="4" w:color="D9D9D9"/>
+              <w:bottom w:val="single" w:sz="4" w:color="D9D9D9"/>
+              <w:right w:val="single" w:sz="4" w:color="D9D9D9"/>
+            </w:tcBorders>
+          </w:tcPr>
+          <w:p>
+            <w:pPr>
+              <w:spacing w:after="80" w:before="80"/>
+            </w:pPr>
+            <w:r>
+              <w:rPr>
+                <w:sz w:val="19"/>
+              </w:rPr>
+              <w:t>Recording rules активны, ошибок evaluation нет.</w:t>
             </w:r>
           </w:p>
         </w:tc>
@@ -893,89 +857,7 @@
     <w:p/>
     <w:p>
       <w:r>
-        <w:t>Native endpoints: TeamCity /app/metrics, Jenkins /prometheus/. В HTTPS примере Service port называется https; поставить реальное имя порта. Для фактического внутреннего HTTP поменять scheme/port и убрать tlsConfig. CA не заменять insecure verification.</w:t>
-      </w:r>
-    </w:p>
-    <w:p>
-      <w:r>
-        <w:t>Probe TeamCity: /healthCheck/ready. Jenkins /login и Octopus / проверяют HTTP reachability; authenticated API проверяется адаптером. Дополнительные внешние probes использовать с другим jobName.</w:t>
-      </w:r>
-    </w:p>
-    <w:p>
-      <w:pPr>
-        <w:pStyle w:val="Code"/>
-      </w:pPr>
-      <w:r>
-        <w:t>kubectl apply --dry-run=server \</w:t>
-      </w:r>
-    </w:p>
-    <w:p>
-      <w:pPr>
-        <w:pStyle w:val="Code"/>
-      </w:pPr>
-      <w:r>
-        <w:t xml:space="preserve">  -f kubernetes/native-metrics.example.yml \</w:t>
-      </w:r>
-    </w:p>
-    <w:p>
-      <w:pPr>
-        <w:pStyle w:val="Code"/>
-      </w:pPr>
-      <w:r>
-        <w:t xml:space="preserve">  -f kubernetes/probes.example.yml \</w:t>
-      </w:r>
-    </w:p>
-    <w:p>
-      <w:pPr>
-        <w:pStyle w:val="Code"/>
-      </w:pPr>
-      <w:r>
-        <w:t xml:space="preserve">  -f kubernetes/recording-rules.yml</w:t>
-      </w:r>
-    </w:p>
-    <w:p>
-      <w:pPr>
-        <w:pStyle w:val="Code"/>
-      </w:pPr>
-      <w:r>
-        <w:t># После проверки повторить ту же команду без --dry-run=server</w:t>
-      </w:r>
-    </w:p>
-    <w:p>
-      <w:pPr>
-        <w:pStyle w:val="Heading2"/>
-      </w:pPr>
-      <w:r>
-        <w:t>Проверить сбор</w:t>
-      </w:r>
-    </w:p>
-    <w:p>
-      <w:pPr>
-        <w:pStyle w:val="ListBullet"/>
-      </w:pPr>
-      <w:r>
-        <w:t>Prometheus Targets: UP для cicd-adapter, teamcity, jenkins и трёх cicd-http targets. Для blackbox дополнительно probe_success = 1.</w:t>
-      </w:r>
-    </w:p>
-    <w:p>
-      <w:pPr>
-        <w:pStyle w:val="ListBullet"/>
-      </w:pPr>
-      <w:r>
-        <w:t>Prometheus Graph: ci_api_up = 1 и ci_collection_complete = 1 для трёх компонентов; timestamp сбора обновляется; ci:operational_state появляется через несколько циклов.</w:t>
-      </w:r>
-    </w:p>
-    <w:p>
-      <w:pPr>
-        <w:pStyle w:val="ListBullet"/>
-      </w:pPr>
-      <w:r>
-        <w:t>Target отсутствует: проверить selectors/namespace/labels/port. DOWN: auth/TLS/path/network. complete=0 при api=1: схема API или лимит страниц.</w:t>
-      </w:r>
-    </w:p>
-    <w:p>
-      <w:r>
-        <w:t>Локальная проверка адаптера: port-forward service/cicd-adapter 8000:8000, затем curl -fsS http://localhost:8000/metrics.</w:t>
+        <w:t>Для TeamCity HA одинаковые node metrics объединяются через max, а не sum. Для Jenkins не суммировать capacity разных пересекающихся labels. Scrape availability не доказывает свежесть внутреннего async collector Jenkins.</w:t>
       </w:r>
     </w:p>
     <w:p>
@@ -988,7 +870,7 @@
         <w:pStyle w:val="Heading1"/>
       </w:pPr>
       <w:r>
-        <w:t>6 Подключить Grafana и алерты</w:t>
+        <w:t>4 Настроить Grafana и уведомления</w:t>
       </w:r>
     </w:p>
     <w:p>
@@ -996,7 +878,7 @@
         <w:pStyle w:val="ListBullet"/>
       </w:pPr>
       <w:r>
-        <w:t>Создать Prometheus datasource с UID cicd-prometheus и URL существующего query endpoint. Подключение должно работать из Grafana server.</w:t>
+        <w:t>Установить официальный Infinity datasource и закрепить проверенную версию. Для серверных alerts использовать backend JSONata: в JSON query parser=backend.</w:t>
       </w:r>
     </w:p>
     <w:p>
@@ -1004,7 +886,7 @@
         <w:pStyle w:val="ListBullet"/>
       </w:pPr>
       <w:r>
-        <w:t>Import cicd-health/cicd-health-dashboard.json. Выбрать datasource; заменить hidden URL constants для ссылок TeamCity/Jenkins/Octopus.</w:t>
+        <w:t>В cicd-health/grafana-datasource.example.yml заменить URL и allowedHosts полными origins. Сохранить UIDs cicd-prometheus, teamcity-api, octopus-api; токены — secureJsonData из Grafana env.</w:t>
       </w:r>
     </w:p>
     <w:p>
@@ -1012,7 +894,7 @@
         <w:pStyle w:val="ListBullet"/>
       </w:pPr>
       <w:r>
-        <w:t>Через Helm/GitOps подключить grafana-alert-rules.yml в /etc/grafana/provisioning/alerting/ и выполнить штатный reload/rollout. Это Grafana-managed alerts, не PrometheusRule alert expressions.</w:t>
+        <w:t>Для частного CA настроить trust в Pod либо Infinity tlsAuthWithCACert и secureJsonData.tlsCACert. tlsSkipVerify оставлять false.</w:t>
       </w:r>
     </w:p>
     <w:p>
@@ -1020,7 +902,7 @@
         <w:pStyle w:val="ListBullet"/>
       </w:pPr>
       <w:r>
-        <w:t>В новой версии deleteRules удаляет старые cicd-capacity и cicd-native-scrape. Остальные старые UID обновляются; новое cicd-agents-low проверяет minimum online count. Не оставлять старые запросы к counters/capacity.</w:t>
+        <w:t>Проверить все 13 моделей infinity-queries.json в Explore: одна числовая колонка. HTTP/auth/schema ошибки и слишком большая running-page должны давать query error.</w:t>
       </w:r>
     </w:p>
     <w:p>
@@ -1028,12 +910,20 @@
         <w:pStyle w:val="ListBullet"/>
       </w:pPr>
       <w:r>
-        <w:t>Создать Teams contact point через Teams Workflow webhook и PagerDuty через integration key. Нажать Test в обоих; ключи не хранить в Git.</w:t>
+        <w:t>Импортировать cicd-health/cicd-health-dashboard.json: 26 панелей со статусами, KPI, HTTP latency и ссылками на детали.</w:t>
+      </w:r>
+    </w:p>
+    <w:p>
+      <w:pPr>
+        <w:pStyle w:val="ListBullet"/>
+      </w:pPr>
+      <w:r>
+        <w:t>Подключить grafana-alert-rules.yml через provisioning alerting; проверить orgId. В комплекте 18 правил и удаление старых custom rule UIDs. Dashboard variables не управляют alerts: scope фиксирован.</w:t>
       </w:r>
     </w:p>
     <w:p>
       <w:r>
-        <w:t>Notification policies: domain=cicd и severity=critical → Teams + PagerDuty; severity=warning → Teams. Проще создать critical contact point с двумя integrations. Группировать по env/component/alertname. Начальные интервалы: group_wait 30 s, group_interval 5 min, repeat_interval 4 h. Отдельно маршрутизировать DatasourceError. Открыть egress Grafana к обоим сервисам.</w:t>
+        <w:t>Создать contact points Teams Workflow webhook и PagerDuty Events API integration. Для domain=cicd настроить warning → Teams, critical → contact point с Teams и PagerDuty. Проверить Test notification и маршрутизацию DatasourceError/NoData, включая случаи без ожидаемых custom labels.</w:t>
       </w:r>
     </w:p>
     <w:tbl>
@@ -1043,8 +933,8 @@
         <w:tblLook w:firstColumn="1" w:firstRow="1" w:lastColumn="0" w:lastRow="0" w:noHBand="0" w:noVBand="1" w:val="04A0"/>
       </w:tblPr>
       <w:tblGrid>
-        <w:gridCol w:w="3816"/>
-        <w:gridCol w:w="6336"/>
+        <w:gridCol w:w="3096"/>
+        <w:gridCol w:w="7056"/>
       </w:tblGrid>
       <w:tr>
         <w:trPr>
@@ -1052,7 +942,7 @@
         </w:trPr>
         <w:tc>
           <w:tcPr>
-            <w:tcW w:type="dxa" w:w="3816"/>
+            <w:tcW w:type="dxa" w:w="3096"/>
             <w:tcBorders>
               <w:top w:val="single" w:sz="4" w:color="D9D9D9"/>
               <w:left w:val="single" w:sz="4" w:color="D9D9D9"/>
@@ -1070,13 +960,13 @@
                 <w:b/>
                 <w:sz w:val="19"/>
               </w:rPr>
-              <w:t>Алерт</w:t>
+              <w:t>Событие</w:t>
             </w:r>
           </w:p>
         </w:tc>
         <w:tc>
           <w:tcPr>
-            <w:tcW w:type="dxa" w:w="6336"/>
+            <w:tcW w:type="dxa" w:w="7056"/>
             <w:tcBorders>
               <w:top w:val="single" w:sz="4" w:color="D9D9D9"/>
               <w:left w:val="single" w:sz="4" w:color="D9D9D9"/>
@@ -1094,7 +984,7 @@
                 <w:b/>
                 <w:sz w:val="19"/>
               </w:rPr>
-              <w:t>Стартовое условие</w:t>
+              <w:t>Условие и выдержка</w:t>
             </w:r>
           </w:p>
         </w:tc>
@@ -1102,7 +992,7 @@
       <w:tr>
         <w:tc>
           <w:tcPr>
-            <w:tcW w:type="dxa" w:w="3816"/>
+            <w:tcW w:type="dxa" w:w="3096"/>
             <w:tcBorders>
               <w:top w:val="single" w:sz="4" w:color="D9D9D9"/>
               <w:left w:val="single" w:sz="4" w:color="D9D9D9"/>
@@ -1118,13 +1008,13 @@
               <w:rPr>
                 <w:sz w:val="19"/>
               </w:rPr>
-              <w:t>HTTP или API недоступен</w:t>
+              <w:t>Сервер или API недоступен</w:t>
             </w:r>
           </w:p>
         </w:tc>
         <w:tc>
           <w:tcPr>
-            <w:tcW w:type="dxa" w:w="6336"/>
+            <w:tcW w:type="dxa" w:w="7056"/>
             <w:tcBorders>
               <w:top w:val="single" w:sz="4" w:color="D9D9D9"/>
               <w:left w:val="single" w:sz="4" w:color="D9D9D9"/>
@@ -1140,7 +1030,7 @@
               <w:rPr>
                 <w:sz w:val="19"/>
               </w:rPr>
-              <w:t>2 min наблюдаемой ошибки; 403/404 тоже могут быть ошибкой прав/config</w:t>
+              <w:t>HTTP/native scrape failure или Octopus query error; 2m.</w:t>
             </w:r>
           </w:p>
         </w:tc>
@@ -1148,7 +1038,7 @@
       <w:tr>
         <w:tc>
           <w:tcPr>
-            <w:tcW w:type="dxa" w:w="3816"/>
+            <w:tcW w:type="dxa" w:w="3096"/>
             <w:tcBorders>
               <w:top w:val="single" w:sz="4" w:color="D9D9D9"/>
               <w:left w:val="single" w:sz="4" w:color="D9D9D9"/>
@@ -1164,13 +1054,13 @@
               <w:rPr>
                 <w:sz w:val="19"/>
               </w:rPr>
-              <w:t>Сбор устарел или неполон</w:t>
+              <w:t>Сборка или deploy упали</w:t>
             </w:r>
           </w:p>
         </w:tc>
         <w:tc>
           <w:tcPr>
-            <w:tcW w:type="dxa" w:w="6336"/>
+            <w:tcW w:type="dxa" w:w="7056"/>
             <w:tcBorders>
               <w:top w:val="single" w:sz="4" w:color="D9D9D9"/>
               <w:left w:val="single" w:sz="4" w:color="D9D9D9"/>
@@ -1186,7 +1076,7 @@
               <w:rPr>
                 <w:sz w:val="19"/>
               </w:rPr>
-              <w:t>Возраст &gt;180 s или incomplete; for 3 min</w:t>
+              <w:t>Последний TC FAILURE / Jenkins ordinal 2 / Octopus Failed или TimedOut; без выдержки.</w:t>
             </w:r>
           </w:p>
         </w:tc>
@@ -1194,7 +1084,7 @@
       <w:tr>
         <w:tc>
           <w:tcPr>
-            <w:tcW w:type="dxa" w:w="3816"/>
+            <w:tcW w:type="dxa" w:w="3096"/>
             <w:tcBorders>
               <w:top w:val="single" w:sz="4" w:color="D9D9D9"/>
               <w:left w:val="single" w:sz="4" w:color="D9D9D9"/>
@@ -1210,13 +1100,13 @@
               <w:rPr>
                 <w:sz w:val="19"/>
               </w:rPr>
-              <w:t>Последний build/deploy неуспешен</w:t>
+              <w:t>Агент недоступен или исчез</w:t>
             </w:r>
           </w:p>
         </w:tc>
         <w:tc>
           <w:tcPr>
-            <w:tcW w:type="dxa" w:w="6336"/>
+            <w:tcW w:type="dxa" w:w="7056"/>
             <w:tcBorders>
               <w:top w:val="single" w:sz="4" w:color="D9D9D9"/>
               <w:left w:val="single" w:sz="4" w:color="D9D9D9"/>
@@ -1232,7 +1122,7 @@
               <w:rPr>
                 <w:sz w:val="19"/>
               </w:rPr>
-              <w:t>Failed/timed out; до следующего terminal result</w:t>
+              <w:t>Постоянный expected agent/node; 5m.</w:t>
             </w:r>
           </w:p>
         </w:tc>
@@ -1240,7 +1130,7 @@
       <w:tr>
         <w:tc>
           <w:tcPr>
-            <w:tcW w:type="dxa" w:w="3816"/>
+            <w:tcW w:type="dxa" w:w="3096"/>
             <w:tcBorders>
               <w:top w:val="single" w:sz="4" w:color="D9D9D9"/>
               <w:left w:val="single" w:sz="4" w:color="D9D9D9"/>
@@ -1256,13 +1146,13 @@
               <w:rPr>
                 <w:sz w:val="19"/>
               </w:rPr>
-              <w:t>Постоянный агент недоступен</w:t>
+              <w:t>Агентов мало</w:t>
             </w:r>
           </w:p>
         </w:tc>
         <w:tc>
           <w:tcPr>
-            <w:tcW w:type="dxa" w:w="6336"/>
+            <w:tcW w:type="dxa" w:w="7056"/>
             <w:tcBorders>
               <w:top w:val="single" w:sz="4" w:color="D9D9D9"/>
               <w:left w:val="single" w:sz="4" w:color="D9D9D9"/>
@@ -1278,7 +1168,7 @@
               <w:rPr>
                 <w:sz w:val="19"/>
               </w:rPr>
-              <w:t>expected_agents offline; for 5 min</w:t>
+              <w:t>Ниже настроенного минимума; 5m.</w:t>
             </w:r>
           </w:p>
         </w:tc>
@@ -1286,7 +1176,7 @@
       <w:tr>
         <w:tc>
           <w:tcPr>
-            <w:tcW w:type="dxa" w:w="3816"/>
+            <w:tcW w:type="dxa" w:w="3096"/>
             <w:tcBorders>
               <w:top w:val="single" w:sz="4" w:color="D9D9D9"/>
               <w:left w:val="single" w:sz="4" w:color="D9D9D9"/>
@@ -1302,13 +1192,13 @@
               <w:rPr>
                 <w:sz w:val="19"/>
               </w:rPr>
-              <w:t>Online agents ниже минимума</w:t>
+              <w:t>Очередь переполнена</w:t>
             </w:r>
           </w:p>
         </w:tc>
         <w:tc>
           <w:tcPr>
-            <w:tcW w:type="dxa" w:w="6336"/>
+            <w:tcW w:type="dxa" w:w="7056"/>
             <w:tcBorders>
               <w:top w:val="single" w:sz="4" w:color="D9D9D9"/>
               <w:left w:val="single" w:sz="4" w:color="D9D9D9"/>
@@ -1324,7 +1214,7 @@
               <w:rPr>
                 <w:sz w:val="19"/>
               </w:rPr>
-              <w:t>agents_minimum; for 5 min</w:t>
+              <w:t>Выше настроенного лимита; 10m.</w:t>
             </w:r>
           </w:p>
         </w:tc>
@@ -1332,7 +1222,7 @@
       <w:tr>
         <w:tc>
           <w:tcPr>
-            <w:tcW w:type="dxa" w:w="3816"/>
+            <w:tcW w:type="dxa" w:w="3096"/>
             <w:tcBorders>
               <w:top w:val="single" w:sz="4" w:color="D9D9D9"/>
               <w:left w:val="single" w:sz="4" w:color="D9D9D9"/>
@@ -1348,13 +1238,13 @@
               <w:rPr>
                 <w:sz w:val="19"/>
               </w:rPr>
-              <w:t>Очередь / долгая сборка</w:t>
+              <w:t>Слишком долгая сборка</w:t>
             </w:r>
           </w:p>
         </w:tc>
         <w:tc>
           <w:tcPr>
-            <w:tcW w:type="dxa" w:w="6336"/>
+            <w:tcW w:type="dxa" w:w="7056"/>
             <w:tcBorders>
               <w:top w:val="single" w:sz="4" w:color="D9D9D9"/>
               <w:left w:val="single" w:sz="4" w:color="D9D9D9"/>
@@ -1370,7 +1260,7 @@
               <w:rPr>
                 <w:sz w:val="19"/>
               </w:rPr>
-              <w:t>queue_limit / ожидание &gt;15 min / timeout_seconds</w:t>
+              <w:t>Running age выше timeout; 5m.</w:t>
             </w:r>
           </w:p>
         </w:tc>
@@ -1378,7 +1268,7 @@
       <w:tr>
         <w:tc>
           <w:tcPr>
-            <w:tcW w:type="dxa" w:w="3816"/>
+            <w:tcW w:type="dxa" w:w="3096"/>
             <w:tcBorders>
               <w:top w:val="single" w:sz="4" w:color="D9D9D9"/>
               <w:left w:val="single" w:sz="4" w:color="D9D9D9"/>
@@ -1400,7 +1290,7 @@
         </w:tc>
         <w:tc>
           <w:tcPr>
-            <w:tcW w:type="dxa" w:w="6336"/>
+            <w:tcW w:type="dxa" w:w="7056"/>
             <w:tcBorders>
               <w:top w:val="single" w:sz="4" w:color="D9D9D9"/>
               <w:left w:val="single" w:sz="4" w:color="D9D9D9"/>
@@ -1416,7 +1306,7 @@
               <w:rPr>
                 <w:sz w:val="19"/>
               </w:rPr>
-              <w:t>Полное время probe &gt;2 s; for 5 min</w:t>
+              <w:t>Response duration больше 2s; 5m.</w:t>
             </w:r>
           </w:p>
         </w:tc>
@@ -1424,45 +1314,8 @@
     </w:tbl>
     <w:p/>
     <w:p>
-      <w:pPr>
-        <w:pStyle w:val="Heading1"/>
-      </w:pPr>
       <w:r>
-        <w:t>7 Проверить и передать команде</w:t>
-      </w:r>
-    </w:p>
-    <w:p>
-      <w:r>
-        <w:t>Проверять в согласованном тестовом контуре. Production для проверки не останавливать.</w:t>
-      </w:r>
-    </w:p>
-    <w:p>
-      <w:pPr>
-        <w:pStyle w:val="ListBullet"/>
-      </w:pPr>
-      <w:r>
-        <w:t>По одной успешной/неуспешной сборке и deploy: увидеть статус, длительность и notification. Удерживать failure минимум два poll цикла.</w:t>
-      </w:r>
-    </w:p>
-    <w:p>
-      <w:pPr>
-        <w:pStyle w:val="ListBullet"/>
-      </w:pPr>
-      <w:r>
-        <w:t>Остановить тестовый adapter: карточки UNKNOWN, устаревшие KPI скрыты. Проверить тестовый API/HTTP failure и последующее восстановление.</w:t>
-      </w:r>
-    </w:p>
-    <w:p>
-      <w:pPr>
-        <w:pStyle w:val="ListBullet"/>
-      </w:pPr>
-      <w:r>
-        <w:t>Проверить queue/agent/long-build alerts, firing/resolved доставку, ссылки и исключение чужих scopes/runbooks.</w:t>
-      </w:r>
-    </w:p>
-    <w:p>
-      <w:r>
-        <w:t>Передать URL dashboard, scopes, пороги, версии, commit образа и результат smoke tests. Назначить владельца и runbook. После параллельного наблюдения сделать Grafana основным инструментом; старый прототип отключить или оставить на большом экране.</w:t>
+        <w:t>Согласовать thresholds, повтор уведомлений, grouping и escalation. Для обязательных KPI Error/NoData не равен успеху; отсутствие running Jenkins builds допускает NoData.</w:t>
       </w:r>
     </w:p>
     <w:p>
@@ -1475,312 +1328,52 @@
         <w:pStyle w:val="Heading1"/>
       </w:pPr>
       <w:r>
-        <w:t>Что показывает первая версия</w:t>
-      </w:r>
-    </w:p>
-    <w:tbl>
-      <w:tblPr>
-        <w:tblW w:type="auto" w:w="0"/>
-        <w:tblLayout w:type="fixed"/>
-        <w:tblLook w:firstColumn="1" w:firstRow="1" w:lastColumn="0" w:lastRow="0" w:noHBand="0" w:noVBand="1" w:val="04A0"/>
-      </w:tblPr>
-      <w:tblGrid>
-        <w:gridCol w:w="5040"/>
-        <w:gridCol w:w="5112"/>
-      </w:tblGrid>
-      <w:tr>
-        <w:trPr>
-          <w:tblHeader/>
-        </w:trPr>
-        <w:tc>
-          <w:tcPr>
-            <w:tcW w:type="dxa" w:w="5040"/>
-            <w:tcBorders>
-              <w:top w:val="single" w:sz="4" w:color="D9D9D9"/>
-              <w:left w:val="single" w:sz="4" w:color="D9D9D9"/>
-              <w:bottom w:val="single" w:sz="4" w:color="D9D9D9"/>
-              <w:right w:val="single" w:sz="4" w:color="D9D9D9"/>
-            </w:tcBorders>
-            <w:shd w:fill="EDF2F7"/>
-          </w:tcPr>
-          <w:p>
-            <w:pPr>
-              <w:spacing w:after="80" w:before="80"/>
-            </w:pPr>
-            <w:r>
-              <w:rPr>
-                <w:b/>
-                <w:sz w:val="19"/>
-              </w:rPr>
-              <w:t>Поддерживается сейчас</w:t>
-            </w:r>
-          </w:p>
-        </w:tc>
-        <w:tc>
-          <w:tcPr>
-            <w:tcW w:type="dxa" w:w="5112"/>
-            <w:tcBorders>
-              <w:top w:val="single" w:sz="4" w:color="D9D9D9"/>
-              <w:left w:val="single" w:sz="4" w:color="D9D9D9"/>
-              <w:bottom w:val="single" w:sz="4" w:color="D9D9D9"/>
-              <w:right w:val="single" w:sz="4" w:color="D9D9D9"/>
-            </w:tcBorders>
-            <w:shd w:fill="EDF2F7"/>
-          </w:tcPr>
-          <w:p>
-            <w:pPr>
-              <w:spacing w:after="80" w:before="80"/>
-            </w:pPr>
-            <w:r>
-              <w:rPr>
-                <w:b/>
-                <w:sz w:val="19"/>
-              </w:rPr>
-              <w:t>Отложено</w:t>
-            </w:r>
-          </w:p>
-        </w:tc>
-      </w:tr>
-      <w:tr>
-        <w:tc>
-          <w:tcPr>
-            <w:tcW w:type="dxa" w:w="5040"/>
-            <w:tcBorders>
-              <w:top w:val="single" w:sz="4" w:color="D9D9D9"/>
-              <w:left w:val="single" w:sz="4" w:color="D9D9D9"/>
-              <w:bottom w:val="single" w:sz="4" w:color="D9D9D9"/>
-              <w:right w:val="single" w:sz="4" w:color="D9D9D9"/>
-            </w:tcBorders>
-          </w:tcPr>
-          <w:p>
-            <w:pPr>
-              <w:spacing w:after="80" w:before="80"/>
-            </w:pPr>
-            <w:r>
-              <w:rPr>
-                <w:sz w:val="19"/>
-              </w:rPr>
-              <w:t>HTTP/API health и свежесть</w:t>
-            </w:r>
-          </w:p>
-        </w:tc>
-        <w:tc>
-          <w:tcPr>
-            <w:tcW w:type="dxa" w:w="5112"/>
-            <w:tcBorders>
-              <w:top w:val="single" w:sz="4" w:color="D9D9D9"/>
-              <w:left w:val="single" w:sz="4" w:color="D9D9D9"/>
-              <w:bottom w:val="single" w:sz="4" w:color="D9D9D9"/>
-              <w:right w:val="single" w:sz="4" w:color="D9D9D9"/>
-            </w:tcBorders>
-          </w:tcPr>
-          <w:p>
-            <w:pPr>
-              <w:spacing w:after="80" w:before="80"/>
-            </w:pPr>
-            <w:r>
-              <w:rPr>
-                <w:sz w:val="19"/>
-              </w:rPr>
-              <w:t>Octopus free slots, worker/target/agent health</w:t>
-            </w:r>
-          </w:p>
-        </w:tc>
-      </w:tr>
-      <w:tr>
-        <w:tc>
-          <w:tcPr>
-            <w:tcW w:type="dxa" w:w="5040"/>
-            <w:tcBorders>
-              <w:top w:val="single" w:sz="4" w:color="D9D9D9"/>
-              <w:left w:val="single" w:sz="4" w:color="D9D9D9"/>
-              <w:bottom w:val="single" w:sz="4" w:color="D9D9D9"/>
-              <w:right w:val="single" w:sz="4" w:color="D9D9D9"/>
-            </w:tcBorders>
-          </w:tcPr>
-          <w:p>
-            <w:pPr>
-              <w:spacing w:after="80" w:before="80"/>
-            </w:pPr>
-            <w:r>
-              <w:rPr>
-                <w:sz w:val="19"/>
-              </w:rPr>
-              <w:t>Последние результаты и длительность</w:t>
-            </w:r>
-          </w:p>
-        </w:tc>
-        <w:tc>
-          <w:tcPr>
-            <w:tcW w:type="dxa" w:w="5112"/>
-            <w:tcBorders>
-              <w:top w:val="single" w:sz="4" w:color="D9D9D9"/>
-              <w:left w:val="single" w:sz="4" w:color="D9D9D9"/>
-              <w:bottom w:val="single" w:sz="4" w:color="D9D9D9"/>
-              <w:right w:val="single" w:sz="4" w:color="D9D9D9"/>
-            </w:tcBorders>
-          </w:tcPr>
-          <w:p>
-            <w:pPr>
-              <w:spacing w:after="80" w:before="80"/>
-            </w:pPr>
-            <w:r>
-              <w:rPr>
-                <w:sz w:val="19"/>
-              </w:rPr>
-              <w:t>p95 и success rate всех запусков за период</w:t>
-            </w:r>
-          </w:p>
-        </w:tc>
-      </w:tr>
-      <w:tr>
-        <w:tc>
-          <w:tcPr>
-            <w:tcW w:type="dxa" w:w="5040"/>
-            <w:tcBorders>
-              <w:top w:val="single" w:sz="4" w:color="D9D9D9"/>
-              <w:left w:val="single" w:sz="4" w:color="D9D9D9"/>
-              <w:bottom w:val="single" w:sz="4" w:color="D9D9D9"/>
-              <w:right w:val="single" w:sz="4" w:color="D9D9D9"/>
-            </w:tcBorders>
-          </w:tcPr>
-          <w:p>
-            <w:pPr>
-              <w:spacing w:after="80" w:before="80"/>
-            </w:pPr>
-            <w:r>
-              <w:rPr>
-                <w:sz w:val="19"/>
-              </w:rPr>
-              <w:t>Доля успешных последних результатов</w:t>
-            </w:r>
-          </w:p>
-        </w:tc>
-        <w:tc>
-          <w:tcPr>
-            <w:tcW w:type="dxa" w:w="5112"/>
-            <w:tcBorders>
-              <w:top w:val="single" w:sz="4" w:color="D9D9D9"/>
-              <w:left w:val="single" w:sz="4" w:color="D9D9D9"/>
-              <w:bottom w:val="single" w:sz="4" w:color="D9D9D9"/>
-              <w:right w:val="single" w:sz="4" w:color="D9D9D9"/>
-            </w:tcBorders>
-          </w:tcPr>
-          <w:p>
-            <w:pPr>
-              <w:spacing w:after="80" w:before="80"/>
-            </w:pPr>
-            <w:r>
-              <w:rPr>
-                <w:sz w:val="19"/>
-              </w:rPr>
-              <w:t>Counters всех событий и уведомление о каждой краткой ошибке</w:t>
-            </w:r>
-          </w:p>
-        </w:tc>
-      </w:tr>
-      <w:tr>
-        <w:tc>
-          <w:tcPr>
-            <w:tcW w:type="dxa" w:w="5040"/>
-            <w:tcBorders>
-              <w:top w:val="single" w:sz="4" w:color="D9D9D9"/>
-              <w:left w:val="single" w:sz="4" w:color="D9D9D9"/>
-              <w:bottom w:val="single" w:sz="4" w:color="D9D9D9"/>
-              <w:right w:val="single" w:sz="4" w:color="D9D9D9"/>
-            </w:tcBorders>
-          </w:tcPr>
-          <w:p>
-            <w:pPr>
-              <w:spacing w:after="80" w:before="80"/>
-            </w:pPr>
-            <w:r>
-              <w:rPr>
-                <w:sz w:val="19"/>
-              </w:rPr>
-              <w:t>Очереди выбранных scopes</w:t>
-            </w:r>
-          </w:p>
-        </w:tc>
-        <w:tc>
-          <w:tcPr>
-            <w:tcW w:type="dxa" w:w="5112"/>
-            <w:tcBorders>
-              <w:top w:val="single" w:sz="4" w:color="D9D9D9"/>
-              <w:left w:val="single" w:sz="4" w:color="D9D9D9"/>
-              <w:bottom w:val="single" w:sz="4" w:color="D9D9D9"/>
-              <w:right w:val="single" w:sz="4" w:color="D9D9D9"/>
-            </w:tcBorders>
-          </w:tcPr>
-          <w:p>
-            <w:pPr>
-              <w:spacing w:after="80" w:before="80"/>
-            </w:pPr>
-            <w:r>
-              <w:rPr>
-                <w:sz w:val="19"/>
-              </w:rPr>
-              <w:t>Свободные слоты с учётом совместимости job</w:t>
-            </w:r>
-          </w:p>
-        </w:tc>
-      </w:tr>
-      <w:tr>
-        <w:tc>
-          <w:tcPr>
-            <w:tcW w:type="dxa" w:w="5040"/>
-            <w:tcBorders>
-              <w:top w:val="single" w:sz="4" w:color="D9D9D9"/>
-              <w:left w:val="single" w:sz="4" w:color="D9D9D9"/>
-              <w:bottom w:val="single" w:sz="4" w:color="D9D9D9"/>
-              <w:right w:val="single" w:sz="4" w:color="D9D9D9"/>
-            </w:tcBorders>
-          </w:tcPr>
-          <w:p>
-            <w:pPr>
-              <w:spacing w:after="80" w:before="80"/>
-            </w:pPr>
-            <w:r>
-              <w:rPr>
-                <w:sz w:val="19"/>
-              </w:rPr>
-              <w:t>Online count TC/Jenkins и постоянные agents</w:t>
-            </w:r>
-          </w:p>
-        </w:tc>
-        <w:tc>
-          <w:tcPr>
-            <w:tcW w:type="dxa" w:w="5112"/>
-            <w:tcBorders>
-              <w:top w:val="single" w:sz="4" w:color="D9D9D9"/>
-              <w:left w:val="single" w:sz="4" w:color="D9D9D9"/>
-              <w:bottom w:val="single" w:sz="4" w:color="D9D9D9"/>
-              <w:right w:val="single" w:sz="4" w:color="D9D9D9"/>
-            </w:tcBorders>
-          </w:tcPr>
-          <w:p>
-            <w:pPr>
-              <w:spacing w:after="80" w:before="80"/>
-            </w:pPr>
-            <w:r>
-              <w:rPr>
-                <w:sz w:val="19"/>
-              </w:rPr>
-              <w:t>Tenant-specific и runbook KPI</w:t>
-            </w:r>
-          </w:p>
-        </w:tc>
-      </w:tr>
-    </w:tbl>
-    <w:p/>
-    <w:p>
-      <w:r>
-        <w:t>Это snapshot MVP: быстрый fail→success между poll может быть пропущен. Failure alert остаётся до следующего terminal result. Для уведомления о каждом запуске нужен webhook/event collector с durable storage, дедупликацией и backfill. Процент в dashboard относится к последним результатам выбранных pipeline, а не к выбранному периоду.</w:t>
+        <w:t>5 Принять решение в эксплуатацию</w:t>
       </w:r>
     </w:p>
     <w:p>
       <w:r>
-        <w:t>Octopus выбирает newest-created terminal Deploy task по project/environment. При concurrent deployments это может отличаться от task с самым поздним CompletedTime. Jenkins active scan читает retained builds страницами; оценить нагрузку и max_pages. Превышение лимита даёт incomplete, а не частичные успешные данные.</w:t>
+        <w:t>Провести согласованные проверки в тестовом scope и передать команде ссылки на dashboard, Prometheus Targets/Rules и результаты тестов.</w:t>
+      </w:r>
+    </w:p>
+    <w:p>
+      <w:pPr>
+        <w:pStyle w:val="ListBullet"/>
+      </w:pPr>
+      <w:r>
+        <w:t>Сделать успешную и неуспешную сборку TC/Jenkins и deploy Octopus. Проверить статусы и notifications; Jenkins UNSTABLE/ABORTED не должны отображаться как FAILURE.</w:t>
+      </w:r>
+    </w:p>
+    <w:p>
+      <w:pPr>
+        <w:pStyle w:val="ListBullet"/>
+      </w:pPr>
+      <w:r>
+        <w:t>Отключить постоянный агент и проверить его исчезновение. Ephemeral Kubernetes Pod не должен вызывать expected-agent false positive.</w:t>
+      </w:r>
+    </w:p>
+    <w:p>
+      <w:pPr>
+        <w:pStyle w:val="ListBullet"/>
+      </w:pPr>
+      <w:r>
+        <w:t>Временно снизить queue/timeout thresholds и проверить firing, затем восстановить production пороги и проверить resolved notifications.</w:t>
+      </w:r>
+    </w:p>
+    <w:p>
+      <w:pPr>
+        <w:pStyle w:val="ListBullet"/>
+      </w:pPr>
+      <w:r>
+        <w:t>Проверить HTTP failure, неверный API token и исчезнувшую series. Dashboard не должен показывать здоровое состояние при ошибке источника.</w:t>
+      </w:r>
+    </w:p>
+    <w:p>
+      <w:pPr>
+        <w:pStyle w:val="ListBullet"/>
+      </w:pPr>
+      <w:r>
+        <w:t>Закрыть dashboard: Infinity rules должны продолжить серверное выполнение, Teams/PagerDuty должны получать уведомления.</w:t>
       </w:r>
     </w:p>
     <w:p>
@@ -1788,36 +1381,17 @@
         <w:pStyle w:val="Heading2"/>
       </w:pPr>
       <w:r>
-        <w:t>Готовые open source компоненты</w:t>
-      </w:r>
-    </w:p>
-    <w:p>
-      <w:pPr>
-        <w:pStyle w:val="ListBullet"/>
-      </w:pPr>
-      <w:r>
-        <w:t>Jenkins Prometheus Plugin — native metrics, Apache-2.0. Унифицированные snapshots собирает наш адаптер.</w:t>
-      </w:r>
-    </w:p>
-    <w:p>
-      <w:pPr>
-        <w:pStyle w:val="ListBullet"/>
-      </w:pPr>
-      <w:r>
-        <w:t>prometheus/blackbox_exporter — HTTP probes, Apache-2.0.</w:t>
-      </w:r>
-    </w:p>
-    <w:p>
-      <w:pPr>
-        <w:pStyle w:val="ListBullet"/>
-      </w:pPr>
-      <w:r>
-        <w:t>octopusden/octopus-teamcity-prometheus-exporter — TeamCity last status по templates, Apache-2.0. Это вариант для TeamCity, не для Octopus Deploy; не заменяет queue/agent сбор этого комплекта.</w:t>
+        <w:t>Границы решения</w:t>
       </w:r>
     </w:p>
     <w:p>
       <w:r>
-        <w:t>Для Octopus Deploy используется REST adapter из репозитория. Его /healthz и /readyz проверяют процесс; source failure остаётся видимым через метрики. Тесты локальных mock APIs не заменяют проверку настоящего кластера. Образ нужно собрать в CI и выполнить smoke tests на установленных версиях.</w:t>
+        <w:t>Polling последних результатов может пропустить fail→success между опросами. Для уведомления о каждом событии дополнительно нужны штатные event notifications систем. В комплекте нет гарантии доставки каждого build/deploy event.</w:t>
+      </w:r>
+    </w:p>
+    <w:p>
+      <w:r>
+        <w:t>REST snapshots не создают историю Prometheus counters. Общий процент успешности всех систем, p95 build duration, Octopus worker capacity и queue waiting age исключены. Running REST queries ограничены 100 задачами в scope; превышение вызывает ошибку вместо неполных данных.</w:t>
       </w:r>
     </w:p>
     <w:p>
@@ -1825,59 +1399,30 @@
         <w:pStyle w:val="Heading2"/>
       </w:pPr>
       <w:r>
-        <w:t>Файлы и справочные материалы</w:t>
+        <w:t>Перевести мониторинг на Grafana</w:t>
       </w:r>
     </w:p>
     <w:p>
       <w:r>
-        <w:t>Полная инструкция с командами и CA настройкой:</w:t>
-        <w:br/>
-        <w:t>https://github.com/sbrw-evc/Test/blob/main/docs/SETUP-RU.md</w:t>
+        <w:t>Назначить владельца dashboard и runbooks. После приёмки остановить кастомный прототип либо оставить экран на тех же источниках. Если развёрнута предыдущая версия комплекта, удалить только её отдельные adapter ресурсы и ненужный config, сверив имена по старому Git commit. Общие Secrets, CA, Prometheus и Grafana не удалять. Сохранить старый commit для rollback.</w:t>
+      </w:r>
+    </w:p>
+    <w:p>
+      <w:pPr>
+        <w:pStyle w:val="Heading2"/>
+      </w:pPr>
+      <w:r>
+        <w:t>Материалы и проверки</w:t>
       </w:r>
     </w:p>
     <w:p>
       <w:r>
-        <w:t>Код: adapter/ • Kubernetes: kubernetes/ • Dashboard и rules: cicd-health/ • Точные значения: cicd-health/METRICS-CONTRACT.md</w:t>
+        <w:t>Подробные команды: docs/SETUP-RU.md. Выбор готовых решений и ссылки на upstream: docs/OSS-SOURCES.md. Контракт метрик: cicd-health/METRICS-CONTRACT.md. Всё находится в github.com/sbrw-evc/Test.</w:t>
       </w:r>
     </w:p>
     <w:p>
       <w:r>
-        <w:rPr>
-          <w:sz w:val="17"/>
-        </w:rPr>
-        <w:t>TeamCity metrics — https://www.jetbrains.com/help/teamcity/teamcity-monitoring-and-diagnostics.html</w:t>
-      </w:r>
-    </w:p>
-    <w:p>
-      <w:r>
-        <w:rPr>
-          <w:sz w:val="17"/>
-        </w:rPr>
-        <w:t>Jenkins plugin — https://github.com/jenkinsci/prometheus-plugin</w:t>
-      </w:r>
-    </w:p>
-    <w:p>
-      <w:r>
-        <w:rPr>
-          <w:sz w:val="17"/>
-        </w:rPr>
-        <w:t>TeamCity OSS exporter — https://github.com/octopusden/octopus-teamcity-prometheus-exporter</w:t>
-      </w:r>
-    </w:p>
-    <w:p>
-      <w:r>
-        <w:rPr>
-          <w:sz w:val="17"/>
-        </w:rPr>
-        <w:t>Octopus tasks API — https://octopus.com/docs/api/tasks</w:t>
-      </w:r>
-    </w:p>
-    <w:p>
-      <w:r>
-        <w:rPr>
-          <w:sz w:val="17"/>
-        </w:rPr>
-        <w:t>Prometheus Operator — https://prometheus-operator.dev/docs/api-reference/api/</w:t>
+        <w:t>Офлайн JSONata fixtures проверяют transformations, но не заменяют real API smoke test. В среде DevOps выполнить promtool check rules, Kubernetes server dry-run, проверку Grafana provisioning, API permissions и доставки notifications.</w:t>
       </w:r>
     </w:p>
     <w:sectPr>
@@ -1902,7 +1447,7 @@
       <w:rPr>
         <w:sz w:val="16"/>
       </w:rPr>
-      <w:t xml:space="preserve">05 октября 2026   •   </w:t>
+      <w:t xml:space="preserve">06 октября 2026   •   </w:t>
     </w:r>
     <w:fldSimple w:instr="PAGE"/>
   </w:p>

</xml_diff>